<commit_message>
feat: Update security guidelines and enhance content in documentation and styles
</commit_message>
<xml_diff>
--- a/docs/HƯỚNG DẪN THỰC HIỆN CHÀO GIÁ.docx
+++ b/docs/HƯỚNG DẪN THỰC HIỆN CHÀO GIÁ.docx
@@ -91,13 +91,7 @@
         <w:jc w:val="both"/>
       </w:pPr>
       <w:r>
-        <w:t xml:space="preserve">Lập 01 file excell chỉ dẫn vị trí tài liệu chứng minh: Yêu cầu kỹ thuật </w:t>
-      </w:r>
-      <w:r>
-        <w:t>của hàng hóa chào</w:t>
-      </w:r>
-      <w:r>
-        <w:t xml:space="preserve"> theo mẫu</w:t>
+        <w:t>Lập 01 file excell chỉ dẫn vị trí tài liệu chứng minh: Yêu cầu kỹ thuật của hàng hóa chào theo mẫu</w:t>
       </w:r>
     </w:p>
     <w:tbl>
@@ -299,8 +293,6 @@
             <w:r>
               <w:t>16-17</w:t>
             </w:r>
-            <w:bookmarkStart w:id="0" w:name="_GoBack"/>
-            <w:bookmarkEnd w:id="0"/>
           </w:p>
         </w:tc>
       </w:tr>
@@ -393,6 +385,30 @@
         </w:rPr>
         <w:t>địa chỉ thông tin người nhận trong Thư mời báo giá</w:t>
       </w:r>
+    </w:p>
+    <w:p>
+      <w:pPr>
+        <w:pStyle w:val="ListParagraph"/>
+        <w:numPr>
+          <w:ilvl w:val="0"/>
+          <w:numId w:val="1"/>
+        </w:numPr>
+        <w:jc w:val="both"/>
+      </w:pPr>
+      <w:r>
+        <w:rPr>
+          <w:b/>
+        </w:rPr>
+        <w:t xml:space="preserve">Để bảo đảm bảo mật thông tin chào giá </w:t>
+      </w:r>
+      <w:r>
+        <w:t>giữa các nhà thầu, Nhà thầu chỉ được thực hiện thao tác chào giá theo trình tự từ Bước 1 đến khi hoàn thành. Hệ thống không cho phép lưu dữ liệu khi Nhà thầu chưa hoàn tất toàn bộ quy trình chào giá</w:t>
+      </w:r>
+      <w:r>
+        <w:t>.</w:t>
+      </w:r>
+      <w:bookmarkStart w:id="0" w:name="_GoBack"/>
+      <w:bookmarkEnd w:id="0"/>
     </w:p>
     <w:p>
       <w:pPr>

</xml_diff>